<commit_message>
Print materials: flyer/display/rollup surse + assets + 404
- flyer/: toate cele 6 HTML (v1/v2/v3 fata+verso), incl. medalii si pasiuni in v2_verso
- display/: display_A/B/C update + display_Z_v1/v2 noi + export_displays_Z.py
- rollup/: rollup_1-4 update, QR corect, slogan, footer 150px
- export_all_pdf.py: POLARIS Bears canonical, 3 rollup-uri noi, Chrome absolute path fix
- assets/: logo-simplified-vector (SVG+PNG+small), qr-code-POLARIS-Bears
- images/generated/404/: doua variante (landscape + portrait)
- t-shirt/: t-shirt LOGO.svg

Co-Authored-By: Claude Sonnet 4.6 <noreply@anthropic.com>
</commit_message>
<xml_diff>
--- a/output/03_Anexa_2_Date_Identificare.docx
+++ b/output/03_Anexa_2_Date_Identificare.docx
@@ -65,12 +65,12 @@
     <w:tbl>
       <w:tblPr>
         <w:tblStyle w:val="TableGrid"/>
-        <w:tblW w:w="9889" w:type="dxa"/>
+        <w:tblW w:w="10456" w:type="dxa"/>
         <w:tblLook w:val="04A0" w:firstRow="1" w:lastRow="0" w:firstColumn="1" w:lastColumn="0" w:noHBand="0" w:noVBand="1"/>
       </w:tblPr>
       <w:tblGrid>
         <w:gridCol w:w="2551"/>
-        <w:gridCol w:w="7338"/>
+        <w:gridCol w:w="7905"/>
       </w:tblGrid>
       <w:tr>
         <w:tc>
@@ -96,7 +96,7 @@
         </w:tc>
         <w:tc>
           <w:tcPr>
-            <w:tcW w:w="7338" w:type="dxa"/>
+            <w:tcW w:w="7905" w:type="dxa"/>
           </w:tcPr>
           <w:p>
             <w:pPr>
@@ -139,7 +139,7 @@
         </w:tc>
         <w:tc>
           <w:tcPr>
-            <w:tcW w:w="7338" w:type="dxa"/>
+            <w:tcW w:w="7905" w:type="dxa"/>
           </w:tcPr>
           <w:p>
             <w:pPr>
@@ -196,7 +196,7 @@
         </w:tc>
         <w:tc>
           <w:tcPr>
-            <w:tcW w:w="7338" w:type="dxa"/>
+            <w:tcW w:w="7905" w:type="dxa"/>
           </w:tcPr>
           <w:p>
             <w:pPr>
@@ -239,7 +239,7 @@
         </w:tc>
         <w:tc>
           <w:tcPr>
-            <w:tcW w:w="7338" w:type="dxa"/>
+            <w:tcW w:w="7905" w:type="dxa"/>
           </w:tcPr>
           <w:p>
             <w:pPr>
@@ -253,7 +253,14 @@
                 <w:sz w:val="20"/>
                 <w:lang w:val="ro-RO"/>
               </w:rPr>
-              <w:t>Științe fundamentale</w:t>
+              <w:t>Ș</w:t>
+            </w:r>
+            <w:r>
+              <w:rPr>
+                <w:sz w:val="20"/>
+                <w:lang w:val="ro-RO"/>
+              </w:rPr>
+              <w:t>tiințe fundamentale</w:t>
             </w:r>
           </w:p>
         </w:tc>
@@ -282,7 +289,7 @@
         </w:tc>
         <w:tc>
           <w:tcPr>
-            <w:tcW w:w="7338" w:type="dxa"/>
+            <w:tcW w:w="7905" w:type="dxa"/>
           </w:tcPr>
           <w:p>
             <w:pPr>
@@ -376,7 +383,7 @@
         </w:tc>
         <w:tc>
           <w:tcPr>
-            <w:tcW w:w="7338" w:type="dxa"/>
+            <w:tcW w:w="7905" w:type="dxa"/>
           </w:tcPr>
           <w:p>
             <w:pPr>
@@ -470,7 +477,7 @@
         </w:tc>
         <w:tc>
           <w:tcPr>
-            <w:tcW w:w="7338" w:type="dxa"/>
+            <w:tcW w:w="7905" w:type="dxa"/>
           </w:tcPr>
           <w:p>
             <w:pPr>
@@ -564,7 +571,7 @@
         </w:tc>
         <w:tc>
           <w:tcPr>
-            <w:tcW w:w="7338" w:type="dxa"/>
+            <w:tcW w:w="7905" w:type="dxa"/>
           </w:tcPr>
           <w:p>
             <w:pPr>
@@ -687,7 +694,7 @@
         </w:tc>
         <w:tc>
           <w:tcPr>
-            <w:tcW w:w="7338" w:type="dxa"/>
+            <w:tcW w:w="7905" w:type="dxa"/>
           </w:tcPr>
           <w:p>
             <w:pPr>
@@ -760,7 +767,7 @@
         </w:tc>
         <w:tc>
           <w:tcPr>
-            <w:tcW w:w="7338" w:type="dxa"/>
+            <w:tcW w:w="7905" w:type="dxa"/>
           </w:tcPr>
           <w:p>
             <w:pPr>
@@ -936,7 +943,7 @@
                 <w:sz w:val="19"/>
                 <w:lang w:val="ro-RO"/>
               </w:rPr>
-              <w:t xml:space="preserve"> optimizarea Star Power Grid</w:t>
+              <w:t xml:space="preserve"> optimizare</w:t>
             </w:r>
           </w:p>
         </w:tc>
@@ -973,7 +980,7 @@
         </w:tc>
         <w:tc>
           <w:tcPr>
-            <w:tcW w:w="7338" w:type="dxa"/>
+            <w:tcW w:w="7905" w:type="dxa"/>
           </w:tcPr>
           <w:p>
             <w:pPr>
@@ -1036,52 +1043,90 @@
         </w:rPr>
       </w:pPr>
     </w:p>
-    <w:p>
-      <w:pPr>
-        <w:spacing w:after="40"/>
-        <w:jc w:val="both"/>
-        <w:rPr>
-          <w:sz w:val="20"/>
-          <w:szCs w:val="20"/>
-          <w:lang w:val="ro-RO"/>
-        </w:rPr>
-      </w:pPr>
-      <w:r>
-        <w:rPr>
-          <w:i/>
-          <w:sz w:val="16"/>
-          <w:szCs w:val="20"/>
-          <w:lang w:val="ro-RO"/>
-        </w:rPr>
-        <w:t xml:space="preserve">Notă: Completarea datelor se va face cu denumiri corecte, cu diacritice, fără prescurtări. Documentul se va transmite în format editabil </w:t>
-      </w:r>
-      <w:r>
-        <w:rPr>
-          <w:i/>
-          <w:sz w:val="16"/>
-          <w:szCs w:val="20"/>
-          <w:lang w:val="ro-RO"/>
-        </w:rPr>
-        <w:t>și</w:t>
-      </w:r>
-      <w:r>
-        <w:rPr>
-          <w:i/>
-          <w:sz w:val="16"/>
-          <w:szCs w:val="20"/>
-          <w:lang w:val="ro-RO"/>
-        </w:rPr>
-        <w:t xml:space="preserve"> scanat.</w:t>
-      </w:r>
-    </w:p>
     <w:sectPr>
+      <w:footerReference w:type="default" r:id="rId8"/>
       <w:pgSz w:w="12240" w:h="15840"/>
-      <w:pgMar w:top="1134" w:right="1041" w:bottom="1134" w:left="1417" w:header="720" w:footer="720" w:gutter="0"/>
+      <w:pgMar w:top="1134" w:right="616" w:bottom="1134" w:left="1417" w:header="720" w:footer="720" w:gutter="0"/>
       <w:cols w:space="720"/>
       <w:docGrid w:linePitch="360"/>
     </w:sectPr>
   </w:body>
 </w:document>
+</file>
+
+<file path=word/endnotes.xml><?xml version="1.0" encoding="utf-8"?>
+<w:endnotes xmlns:wpc="http://schemas.microsoft.com/office/word/2010/wordprocessingCanvas" xmlns:cx="http://schemas.microsoft.com/office/drawing/2014/chartex" xmlns:cx1="http://schemas.microsoft.com/office/drawing/2015/9/8/chartex" xmlns:cx2="http://schemas.microsoft.com/office/drawing/2015/10/21/chartex" xmlns:cx3="http://schemas.microsoft.com/office/drawing/2016/5/9/chartex" xmlns:cx4="http://schemas.microsoft.com/office/drawing/2016/5/10/chartex" xmlns:cx5="http://schemas.microsoft.com/office/drawing/2016/5/11/chartex" xmlns:cx6="http://schemas.microsoft.com/office/drawing/2016/5/12/chartex" xmlns:cx7="http://schemas.microsoft.com/office/drawing/2016/5/13/chartex" xmlns:cx8="http://schemas.microsoft.com/office/drawing/2016/5/14/chartex" xmlns:mc="http://schemas.openxmlformats.org/markup-compatibility/2006" xmlns:aink="http://schemas.microsoft.com/office/drawing/2016/ink" xmlns:am3d="http://schemas.microsoft.com/office/drawing/2017/model3d" xmlns:o="urn:schemas-microsoft-com:office:office" xmlns:oel="http://schemas.microsoft.com/office/2019/extlst" xmlns:r="http://schemas.openxmlformats.org/officeDocument/2006/relationships" xmlns:m="http://schemas.openxmlformats.org/officeDocument/2006/math" xmlns:v="urn:schemas-microsoft-com:vml" xmlns:wp14="http://schemas.microsoft.com/office/word/2010/wordprocessingDrawing" xmlns:wp="http://schemas.openxmlformats.org/drawingml/2006/wordprocessingDrawing" xmlns:w10="urn:schemas-microsoft-com:office:word" xmlns:w="http://schemas.openxmlformats.org/wordprocessingml/2006/main" xmlns:w14="http://schemas.microsoft.com/office/word/2010/wordml" xmlns:w15="http://schemas.microsoft.com/office/word/2012/wordml" xmlns:w16cex="http://schemas.microsoft.com/office/word/2018/wordml/cex" xmlns:w16cid="http://schemas.microsoft.com/office/word/2016/wordml/cid" xmlns:w16="http://schemas.microsoft.com/office/word/2018/wordml" xmlns:w16du="http://schemas.microsoft.com/office/word/2023/wordml/word16du" xmlns:w16sdtdh="http://schemas.microsoft.com/office/word/2020/wordml/sdtdatahash" xmlns:w16sdtfl="http://schemas.microsoft.com/office/word/2024/wordml/sdtformatlock" xmlns:w16se="http://schemas.microsoft.com/office/word/2015/wordml/symex" xmlns:wpg="http://schemas.microsoft.com/office/word/2010/wordprocessingGroup" xmlns:wpi="http://schemas.microsoft.com/office/word/2010/wordprocessingInk" xmlns:wne="http://schemas.microsoft.com/office/word/2006/wordml" xmlns:wps="http://schemas.microsoft.com/office/word/2010/wordprocessingShape" mc:Ignorable="w14 w15 w16se w16cid w16 w16cex w16sdtdh w16sdtfl w16du wp14">
+  <w:endnote w:type="separator" w:id="-1">
+    <w:p>
+      <w:pPr>
+        <w:spacing w:after="0" w:line="240" w:lineRule="auto"/>
+      </w:pPr>
+      <w:r>
+        <w:separator/>
+      </w:r>
+    </w:p>
+  </w:endnote>
+  <w:endnote w:type="continuationSeparator" w:id="0">
+    <w:p>
+      <w:pPr>
+        <w:spacing w:after="0" w:line="240" w:lineRule="auto"/>
+      </w:pPr>
+      <w:r>
+        <w:continuationSeparator/>
+      </w:r>
+    </w:p>
+  </w:endnote>
+</w:endnotes>
+</file>
+
+<file path=word/footer1.xml><?xml version="1.0" encoding="utf-8"?>
+<w:ftr xmlns:wpc="http://schemas.microsoft.com/office/word/2010/wordprocessingCanvas" xmlns:cx="http://schemas.microsoft.com/office/drawing/2014/chartex" xmlns:cx1="http://schemas.microsoft.com/office/drawing/2015/9/8/chartex" xmlns:cx2="http://schemas.microsoft.com/office/drawing/2015/10/21/chartex" xmlns:cx3="http://schemas.microsoft.com/office/drawing/2016/5/9/chartex" xmlns:cx4="http://schemas.microsoft.com/office/drawing/2016/5/10/chartex" xmlns:cx5="http://schemas.microsoft.com/office/drawing/2016/5/11/chartex" xmlns:cx6="http://schemas.microsoft.com/office/drawing/2016/5/12/chartex" xmlns:cx7="http://schemas.microsoft.com/office/drawing/2016/5/13/chartex" xmlns:cx8="http://schemas.microsoft.com/office/drawing/2016/5/14/chartex" xmlns:mc="http://schemas.openxmlformats.org/markup-compatibility/2006" xmlns:aink="http://schemas.microsoft.com/office/drawing/2016/ink" xmlns:am3d="http://schemas.microsoft.com/office/drawing/2017/model3d" xmlns:o="urn:schemas-microsoft-com:office:office" xmlns:oel="http://schemas.microsoft.com/office/2019/extlst" xmlns:r="http://schemas.openxmlformats.org/officeDocument/2006/relationships" xmlns:m="http://schemas.openxmlformats.org/officeDocument/2006/math" xmlns:v="urn:schemas-microsoft-com:vml" xmlns:wp14="http://schemas.microsoft.com/office/word/2010/wordprocessingDrawing" xmlns:wp="http://schemas.openxmlformats.org/drawingml/2006/wordprocessingDrawing" xmlns:w10="urn:schemas-microsoft-com:office:word" xmlns:w="http://schemas.openxmlformats.org/wordprocessingml/2006/main" xmlns:w14="http://schemas.microsoft.com/office/word/2010/wordml" xmlns:w15="http://schemas.microsoft.com/office/word/2012/wordml" xmlns:w16cex="http://schemas.microsoft.com/office/word/2018/wordml/cex" xmlns:w16cid="http://schemas.microsoft.com/office/word/2016/wordml/cid" xmlns:w16="http://schemas.microsoft.com/office/word/2018/wordml" xmlns:w16du="http://schemas.microsoft.com/office/word/2023/wordml/word16du" xmlns:w16sdtdh="http://schemas.microsoft.com/office/word/2020/wordml/sdtdatahash" xmlns:w16sdtfl="http://schemas.microsoft.com/office/word/2024/wordml/sdtformatlock" xmlns:w16se="http://schemas.microsoft.com/office/word/2015/wordml/symex" xmlns:wpg="http://schemas.microsoft.com/office/word/2010/wordprocessingGroup" xmlns:wpi="http://schemas.microsoft.com/office/word/2010/wordprocessingInk" xmlns:wne="http://schemas.microsoft.com/office/word/2006/wordml" xmlns:wps="http://schemas.microsoft.com/office/word/2010/wordprocessingShape" mc:Ignorable="w14 w15 w16se w16cid w16 w16cex w16sdtdh w16sdtfl w16du wp14">
+  <w:p>
+    <w:pPr>
+      <w:spacing w:after="40"/>
+      <w:jc w:val="both"/>
+      <w:rPr>
+        <w:sz w:val="20"/>
+        <w:szCs w:val="20"/>
+        <w:lang w:val="ro-RO"/>
+      </w:rPr>
+    </w:pPr>
+    <w:r>
+      <w:rPr>
+        <w:i/>
+        <w:sz w:val="16"/>
+        <w:szCs w:val="20"/>
+        <w:lang w:val="ro-RO"/>
+      </w:rPr>
+      <w:t>Notă: Completarea datelor se va face cu denumiri corecte, cu diacritice, fără prescurtări. Documentul se va transmite în format editabil și scanat.</w:t>
+    </w:r>
+  </w:p>
+</w:ftr>
+</file>
+
+<file path=word/footnotes.xml><?xml version="1.0" encoding="utf-8"?>
+<w:footnotes xmlns:wpc="http://schemas.microsoft.com/office/word/2010/wordprocessingCanvas" xmlns:cx="http://schemas.microsoft.com/office/drawing/2014/chartex" xmlns:cx1="http://schemas.microsoft.com/office/drawing/2015/9/8/chartex" xmlns:cx2="http://schemas.microsoft.com/office/drawing/2015/10/21/chartex" xmlns:cx3="http://schemas.microsoft.com/office/drawing/2016/5/9/chartex" xmlns:cx4="http://schemas.microsoft.com/office/drawing/2016/5/10/chartex" xmlns:cx5="http://schemas.microsoft.com/office/drawing/2016/5/11/chartex" xmlns:cx6="http://schemas.microsoft.com/office/drawing/2016/5/12/chartex" xmlns:cx7="http://schemas.microsoft.com/office/drawing/2016/5/13/chartex" xmlns:cx8="http://schemas.microsoft.com/office/drawing/2016/5/14/chartex" xmlns:mc="http://schemas.openxmlformats.org/markup-compatibility/2006" xmlns:aink="http://schemas.microsoft.com/office/drawing/2016/ink" xmlns:am3d="http://schemas.microsoft.com/office/drawing/2017/model3d" xmlns:o="urn:schemas-microsoft-com:office:office" xmlns:oel="http://schemas.microsoft.com/office/2019/extlst" xmlns:r="http://schemas.openxmlformats.org/officeDocument/2006/relationships" xmlns:m="http://schemas.openxmlformats.org/officeDocument/2006/math" xmlns:v="urn:schemas-microsoft-com:vml" xmlns:wp14="http://schemas.microsoft.com/office/word/2010/wordprocessingDrawing" xmlns:wp="http://schemas.openxmlformats.org/drawingml/2006/wordprocessingDrawing" xmlns:w10="urn:schemas-microsoft-com:office:word" xmlns:w="http://schemas.openxmlformats.org/wordprocessingml/2006/main" xmlns:w14="http://schemas.microsoft.com/office/word/2010/wordml" xmlns:w15="http://schemas.microsoft.com/office/word/2012/wordml" xmlns:w16cex="http://schemas.microsoft.com/office/word/2018/wordml/cex" xmlns:w16cid="http://schemas.microsoft.com/office/word/2016/wordml/cid" xmlns:w16="http://schemas.microsoft.com/office/word/2018/wordml" xmlns:w16du="http://schemas.microsoft.com/office/word/2023/wordml/word16du" xmlns:w16sdtdh="http://schemas.microsoft.com/office/word/2020/wordml/sdtdatahash" xmlns:w16sdtfl="http://schemas.microsoft.com/office/word/2024/wordml/sdtformatlock" xmlns:w16se="http://schemas.microsoft.com/office/word/2015/wordml/symex" xmlns:wpg="http://schemas.microsoft.com/office/word/2010/wordprocessingGroup" xmlns:wpi="http://schemas.microsoft.com/office/word/2010/wordprocessingInk" xmlns:wne="http://schemas.microsoft.com/office/word/2006/wordml" xmlns:wps="http://schemas.microsoft.com/office/word/2010/wordprocessingShape" mc:Ignorable="w14 w15 w16se w16cid w16 w16cex w16sdtdh w16sdtfl w16du wp14">
+  <w:footnote w:type="separator" w:id="-1">
+    <w:p>
+      <w:pPr>
+        <w:spacing w:after="0" w:line="240" w:lineRule="auto"/>
+      </w:pPr>
+      <w:r>
+        <w:separator/>
+      </w:r>
+    </w:p>
+  </w:footnote>
+  <w:footnote w:type="continuationSeparator" w:id="0">
+    <w:p>
+      <w:pPr>
+        <w:spacing w:after="0" w:line="240" w:lineRule="auto"/>
+      </w:pPr>
+      <w:r>
+        <w:continuationSeparator/>
+      </w:r>
+    </w:p>
+  </w:footnote>
+</w:footnotes>
 </file>
 
 <file path=word/numbering.xml><?xml version="1.0" encoding="utf-8"?>

</xml_diff>